<commit_message>
feat: scorecard leads with youth voice time; expression index removed from UI and report; clearer source labels and fact cards
</commit_message>
<xml_diff>
--- a/docs/samples/insights_report_sample.docx
+++ b/docs/samples/insights_report_sample.docx
@@ -25,7 +25,7 @@
         <w:rPr>
           <w:i/>
         </w:rPr>
-        <w:t>Results from 24 October 2026.</w:t>
+        <w:t>Results from 25 October 2026.</w:t>
       </w:r>
     </w:p>
     <w:p>
@@ -335,158 +335,6 @@
         <w:t>Among 8-second clips where faces were visible, the share where the AI suggested a positive expression such as a smile. This is an unvalidated AI suggestion about what the camera shows, never a measure of feelings.</w:t>
       </w:r>
     </w:p>
-    <w:p>
-      <w:pPr>
-        <w:pStyle w:val="Heading1"/>
-      </w:pPr>
-      <w:r>
-        <w:t>TPA Expression Index (optional example)</w:t>
-      </w:r>
-    </w:p>
-    <w:p>
-      <w:r>
-        <w:t>Equal-weight mean of the four headline indicators, each scaled to 0-100 (shares x 100; per-hour values against the cap in `insights.expression_index`). Program level only, not a ranking. Caveats: performance share rises partly by design as the program moves toward the showcase, and expressions are unvalidated model estimates.</w:t>
-      </w:r>
-    </w:p>
-    <w:tbl>
-      <w:tblPr>
-        <w:tblStyle w:val="LightGrid-Accent1"/>
-        <w:tblW w:type="auto" w:w="0"/>
-        <w:tblLook w:firstColumn="1" w:firstRow="1" w:lastColumn="0" w:lastRow="0" w:noHBand="0" w:noVBand="1" w:val="04A0"/>
-      </w:tblPr>
-      <w:tblGrid>
-        <w:gridCol w:w="2160"/>
-        <w:gridCol w:w="2160"/>
-        <w:gridCol w:w="2160"/>
-        <w:gridCol w:w="2160"/>
-      </w:tblGrid>
-      <w:tr>
-        <w:tc>
-          <w:tcPr>
-            <w:tcW w:type="dxa" w:w="2160"/>
-          </w:tcPr>
-          <w:p>
-            <w:r>
-              <w:t>Program phase</w:t>
-            </w:r>
-          </w:p>
-        </w:tc>
-        <w:tc>
-          <w:tcPr>
-            <w:tcW w:type="dxa" w:w="2160"/>
-          </w:tcPr>
-          <w:p>
-            <w:r>
-              <w:t>Index (0-100)</w:t>
-            </w:r>
-          </w:p>
-        </w:tc>
-        <w:tc>
-          <w:tcPr>
-            <w:tcW w:type="dxa" w:w="2160"/>
-          </w:tcPr>
-          <w:p>
-            <w:r>
-              <w:t>Label</w:t>
-            </w:r>
-          </w:p>
-        </w:tc>
-        <w:tc>
-          <w:tcPr>
-            <w:tcW w:type="dxa" w:w="2160"/>
-          </w:tcPr>
-          <w:p>
-            <w:r>
-              <w:t>Label of its least-confirmed part</w:t>
-            </w:r>
-          </w:p>
-        </w:tc>
-      </w:tr>
-      <w:tr>
-        <w:tc>
-          <w:tcPr>
-            <w:tcW w:type="dxa" w:w="2160"/>
-          </w:tcPr>
-          <w:p>
-            <w:r>
-              <w:t>Early sessions</w:t>
-            </w:r>
-          </w:p>
-        </w:tc>
-        <w:tc>
-          <w:tcPr>
-            <w:tcW w:type="dxa" w:w="2160"/>
-          </w:tcPr>
-          <w:p>
-            <w:r>
-              <w:t>42</w:t>
-            </w:r>
-          </w:p>
-        </w:tc>
-        <w:tc>
-          <w:tcPr>
-            <w:tcW w:type="dxa" w:w="2160"/>
-          </w:tcPr>
-          <w:p>
-            <w:r>
-              <w:t>example, based on unvalidated model suggestions</w:t>
-            </w:r>
-          </w:p>
-        </w:tc>
-        <w:tc>
-          <w:tcPr>
-            <w:tcW w:type="dxa" w:w="2160"/>
-          </w:tcPr>
-          <w:p>
-            <w:r>
-              <w:t>model estimate (unvalidated)</w:t>
-            </w:r>
-          </w:p>
-        </w:tc>
-      </w:tr>
-      <w:tr>
-        <w:tc>
-          <w:tcPr>
-            <w:tcW w:type="dxa" w:w="2160"/>
-          </w:tcPr>
-          <w:p>
-            <w:r>
-              <w:t>Showcase</w:t>
-            </w:r>
-          </w:p>
-        </w:tc>
-        <w:tc>
-          <w:tcPr>
-            <w:tcW w:type="dxa" w:w="2160"/>
-          </w:tcPr>
-          <w:p>
-            <w:r>
-              <w:t>68</w:t>
-            </w:r>
-          </w:p>
-        </w:tc>
-        <w:tc>
-          <w:tcPr>
-            <w:tcW w:type="dxa" w:w="2160"/>
-          </w:tcPr>
-          <w:p>
-            <w:r>
-              <w:t>example, based on unvalidated model suggestions</w:t>
-            </w:r>
-          </w:p>
-        </w:tc>
-        <w:tc>
-          <w:tcPr>
-            <w:tcW w:type="dxa" w:w="2160"/>
-          </w:tcPr>
-          <w:p>
-            <w:r>
-              <w:t>model estimate (unvalidated)</w:t>
-            </w:r>
-          </w:p>
-        </w:tc>
-      </w:tr>
-    </w:tbl>
     <w:p>
       <w:pPr>
         <w:pStyle w:val="Heading1"/>
@@ -856,7 +704,7 @@
         <w:color w:val="6F717A"/>
         <w:sz w:val="16"/>
       </w:rPr>
-      <w:t>Guideline version 0.5.0 (current vocabulary) · Results: insights-20261024T221306-14d5 · Generated 2026-10-24</w:t>
+      <w:t>Guideline version 0.6.0 (current vocabulary) · Results: insights-20261025T015244-652f · Generated 2026-10-25</w:t>
     </w:r>
   </w:p>
 </w:ftr>

</xml_diff>

<commit_message>
feat: professional funder report (cover, at a glance, how we measured it, data protection, good to know)
</commit_message>
<xml_diff>
--- a/docs/samples/insights_report_sample.docx
+++ b/docs/samples/insights_report_sample.docx
@@ -5,9 +5,27 @@
     <w:p>
       <w:pPr>
         <w:pStyle w:val="Title"/>
+        <w:spacing w:before="0" w:after="40"/>
       </w:pPr>
       <w:r>
-        <w:t>Program insights: youth activity in TPA footage</w:t>
+        <w:t>Program Impact Report</w:t>
+      </w:r>
+    </w:p>
+    <w:p>
+      <w:r>
+        <w:rPr>
+          <w:b/>
+          <w:sz w:val="26"/>
+        </w:rPr>
+        <w:t>The Performance Academy · This Is ME</w:t>
+      </w:r>
+    </w:p>
+    <w:p>
+      <w:r>
+        <w:rPr>
+          <w:color w:val="6F717A"/>
+        </w:rPr>
+        <w:t>Generated 25 October 2026</w:t>
       </w:r>
     </w:p>
     <w:p>
@@ -15,36 +33,23 @@
         <w:rPr>
           <w:b/>
           <w:color w:val="4100AD"/>
-          <w:sz w:val="26"/>
+          <w:sz w:val="24"/>
         </w:rPr>
         <w:t>SAMPLE — generated from mock test data. These numbers are not real program results.</w:t>
-      </w:r>
-    </w:p>
-    <w:p>
-      <w:r>
-        <w:rPr>
-          <w:i/>
-        </w:rPr>
-        <w:t>Results from 25 October 2026.</w:t>
-      </w:r>
-    </w:p>
-    <w:p>
-      <w:pPr>
-        <w:pStyle w:val="Heading1"/>
-      </w:pPr>
-      <w:r>
-        <w:t>What this report is</w:t>
-      </w:r>
-    </w:p>
-    <w:p>
-      <w:r>
-        <w:t>This report summarises what an AI-assisted review of TPA program footage found. It covers youth time only: time led by staff and idle or setup time are left out. It describes the footage as a whole, never any individual young person. The AI makes suggestions, and staff review confirms them; each number says how much of it staff have confirmed.</w:t>
       </w:r>
     </w:p>
     <w:tbl>
       <w:tblPr>
         <w:tblW w:type="auto" w:w="0"/>
         <w:tblLook w:firstColumn="1" w:firstRow="1" w:lastColumn="0" w:lastRow="0" w:noHBand="0" w:noVBand="1" w:val="04A0"/>
+        <w:tblBorders>
+          <w:top w:val="single" w:sz="4" w:color="E6E3EA"/>
+          <w:left w:val="single" w:sz="4" w:color="E6E3EA"/>
+          <w:bottom w:val="single" w:sz="4" w:color="E6E3EA"/>
+          <w:right w:val="single" w:sz="4" w:color="E6E3EA"/>
+          <w:insideH w:val="single" w:sz="4" w:color="E6E3EA"/>
+          <w:insideV w:val="single" w:sz="4" w:color="E6E3EA"/>
+        </w:tblBorders>
       </w:tblPr>
       <w:tblGrid>
         <w:gridCol w:w="8640"/>
@@ -53,65 +58,85 @@
         <w:tc>
           <w:tcPr>
             <w:tcW w:type="dxa" w:w="8640"/>
-            <w:shd w:val="clear" w:fill="F8F7F8"/>
+            <w:shd w:val="clear" w:fill="F1ECF9"/>
           </w:tcPr>
           <w:p>
+            <w:pPr>
+              <w:spacing w:before="80" w:after="80"/>
+            </w:pPr>
             <w:r>
               <w:rPr>
                 <w:b/>
+                <w:color w:val="4100AD"/>
               </w:rPr>
-              <w:t>Key findings at a glance</w:t>
+              <w:t>At a glance</w:t>
             </w:r>
           </w:p>
           <w:p>
             <w:pPr>
               <w:pStyle w:val="ListBullet"/>
+              <w:spacing w:before="0" w:after="60"/>
             </w:pPr>
             <w:r>
-              <w:t>Time spent performing rose from 89% to 93% of youth time, from early sessions to the showcase (early: mixed (61% staff-verified); showcase: mixed (79% staff-verified)).</w:t>
+              <w:t>Time spent performing rose from 89% to 93% of youth time, from early sessions to the showcase (Partly verified).</w:t>
             </w:r>
           </w:p>
           <w:p>
             <w:pPr>
               <w:pStyle w:val="ListBullet"/>
+              <w:spacing w:before="0" w:after="60"/>
             </w:pPr>
             <w:r>
-              <w:t>Solo performance time fell from 15.0 to 12.9 minutes per hour of youth footage, from early sessions to the showcase (early: mixed (57% staff-verified); showcase: mixed (67% staff-verified)).</w:t>
+              <w:t>Solo performance time fell from 15.0 to 12.9 minutes per hour of youth footage, from early sessions to the showcase (Partly verified).</w:t>
             </w:r>
           </w:p>
           <w:p>
             <w:pPr>
               <w:pStyle w:val="ListBullet"/>
+              <w:spacing w:before="0" w:after="60"/>
             </w:pPr>
             <w:r>
-              <w:t>Youth voice time rose from 32.1 to 34.3 minutes per hour of youth footage, from early sessions to the showcase (early: mixed (61% staff-verified); showcase: mixed (79% staff-verified)).</w:t>
+              <w:t>Youth voice time rose from 32.1 to 34.3 minutes per hour of youth footage, from early sessions to the showcase (Partly verified).</w:t>
             </w:r>
           </w:p>
           <w:p>
             <w:pPr>
               <w:pStyle w:val="ListBullet"/>
+              <w:spacing w:before="0" w:after="60"/>
             </w:pPr>
             <w:r>
-              <w:t>Positive expressions (unvalidated) rose from 0% to 100% of clips with visible faces, from early sessions to the showcase (model estimate (unvalidated)).</w:t>
+              <w:t>Positive expressions (unvalidated) rose from 0% to 100% of clips with visible faces, from early sessions to the showcase (AI estimate (unchecked)).</w:t>
             </w:r>
           </w:p>
         </w:tc>
       </w:tr>
     </w:tbl>
-    <w:p/>
+    <w:p>
+      <w:pPr>
+        <w:spacing w:before="0" w:after="80"/>
+      </w:pPr>
+    </w:p>
     <w:p>
       <w:pPr>
         <w:pStyle w:val="Heading1"/>
+        <w:spacing w:before="280" w:after="120"/>
       </w:pPr>
       <w:r>
-        <w:t>What did young people do, from early sessions to the showcase?</w:t>
+        <w:t>Youth indicators by phase</w:t>
       </w:r>
     </w:p>
     <w:tbl>
       <w:tblPr>
-        <w:tblStyle w:val="LightGrid-Accent1"/>
         <w:tblW w:type="auto" w:w="0"/>
         <w:tblLook w:firstColumn="1" w:firstRow="1" w:lastColumn="0" w:lastRow="0" w:noHBand="0" w:noVBand="1" w:val="04A0"/>
+        <w:tblBorders>
+          <w:top w:val="single" w:sz="4" w:color="E6E3EA"/>
+          <w:left w:val="single" w:sz="4" w:color="E6E3EA"/>
+          <w:bottom w:val="single" w:sz="4" w:color="E6E3EA"/>
+          <w:right w:val="single" w:sz="4" w:color="E6E3EA"/>
+          <w:insideH w:val="single" w:sz="4" w:color="E6E3EA"/>
+          <w:insideV w:val="single" w:sz="4" w:color="E6E3EA"/>
+        </w:tblBorders>
       </w:tblPr>
       <w:tblGrid>
         <w:gridCol w:w="2880"/>
@@ -122,19 +147,29 @@
         <w:tc>
           <w:tcPr>
             <w:tcW w:type="dxa" w:w="2880"/>
+            <w:shd w:val="clear" w:fill="4100AD"/>
           </w:tcPr>
           <w:p>
             <w:r>
-              <w:t>What we measured</w:t>
+              <w:rPr>
+                <w:b/>
+                <w:color w:val="FFFFFF"/>
+              </w:rPr>
+              <w:t>Measure</w:t>
             </w:r>
           </w:p>
         </w:tc>
         <w:tc>
           <w:tcPr>
             <w:tcW w:type="dxa" w:w="2880"/>
+            <w:shd w:val="clear" w:fill="4100AD"/>
           </w:tcPr>
           <w:p>
             <w:r>
+              <w:rPr>
+                <w:b/>
+                <w:color w:val="FFFFFF"/>
+              </w:rPr>
               <w:t>Early sessions</w:t>
             </w:r>
           </w:p>
@@ -142,9 +177,14 @@
         <w:tc>
           <w:tcPr>
             <w:tcW w:type="dxa" w:w="2880"/>
+            <w:shd w:val="clear" w:fill="4100AD"/>
           </w:tcPr>
           <w:p>
             <w:r>
+              <w:rPr>
+                <w:b/>
+                <w:color w:val="FFFFFF"/>
+              </w:rPr>
               <w:t>Showcase</w:t>
             </w:r>
           </w:p>
@@ -167,7 +207,16 @@
           </w:tcPr>
           <w:p>
             <w:r>
-              <w:t>89% (mixed (61% staff-verified))</w:t>
+              <w:t>89%</w:t>
+            </w:r>
+          </w:p>
+          <w:p>
+            <w:r>
+              <w:rPr>
+                <w:color w:val="6F717A"/>
+                <w:sz w:val="17"/>
+              </w:rPr>
+              <w:t>Partly verified</w:t>
             </w:r>
           </w:p>
         </w:tc>
@@ -177,7 +226,16 @@
           </w:tcPr>
           <w:p>
             <w:r>
-              <w:t>93% (mixed (79% staff-verified))</w:t>
+              <w:t>93%</w:t>
+            </w:r>
+          </w:p>
+          <w:p>
+            <w:r>
+              <w:rPr>
+                <w:color w:val="6F717A"/>
+                <w:sz w:val="17"/>
+              </w:rPr>
+              <w:t>Partly verified</w:t>
             </w:r>
           </w:p>
         </w:tc>
@@ -186,6 +244,7 @@
         <w:tc>
           <w:tcPr>
             <w:tcW w:type="dxa" w:w="2880"/>
+            <w:shd w:val="clear" w:fill="F8F7F8"/>
           </w:tcPr>
           <w:p>
             <w:r>
@@ -196,20 +255,40 @@
         <w:tc>
           <w:tcPr>
             <w:tcW w:type="dxa" w:w="2880"/>
+            <w:shd w:val="clear" w:fill="F8F7F8"/>
           </w:tcPr>
           <w:p>
             <w:r>
-              <w:t>15.0 min/h (mixed (57% staff-verified))</w:t>
+              <w:t>15.0 min/h</w:t>
+            </w:r>
+          </w:p>
+          <w:p>
+            <w:r>
+              <w:rPr>
+                <w:color w:val="6F717A"/>
+                <w:sz w:val="17"/>
+              </w:rPr>
+              <w:t>Partly verified</w:t>
             </w:r>
           </w:p>
         </w:tc>
         <w:tc>
           <w:tcPr>
             <w:tcW w:type="dxa" w:w="2880"/>
+            <w:shd w:val="clear" w:fill="F8F7F8"/>
           </w:tcPr>
           <w:p>
             <w:r>
-              <w:t>12.9 min/h (mixed (67% staff-verified))</w:t>
+              <w:t>12.9 min/h</w:t>
+            </w:r>
+          </w:p>
+          <w:p>
+            <w:r>
+              <w:rPr>
+                <w:color w:val="6F717A"/>
+                <w:sz w:val="17"/>
+              </w:rPr>
+              <w:t>Partly verified</w:t>
             </w:r>
           </w:p>
         </w:tc>
@@ -231,7 +310,16 @@
           </w:tcPr>
           <w:p>
             <w:r>
-              <w:t>32.1 min/h (mixed (61% staff-verified))</w:t>
+              <w:t>32.1 min/h</w:t>
+            </w:r>
+          </w:p>
+          <w:p>
+            <w:r>
+              <w:rPr>
+                <w:color w:val="6F717A"/>
+                <w:sz w:val="17"/>
+              </w:rPr>
+              <w:t>Partly verified</w:t>
             </w:r>
           </w:p>
         </w:tc>
@@ -241,7 +329,16 @@
           </w:tcPr>
           <w:p>
             <w:r>
-              <w:t>34.3 min/h (mixed (79% staff-verified))</w:t>
+              <w:t>34.3 min/h</w:t>
+            </w:r>
+          </w:p>
+          <w:p>
+            <w:r>
+              <w:rPr>
+                <w:color w:val="6F717A"/>
+                <w:sz w:val="17"/>
+              </w:rPr>
+              <w:t>Partly verified</w:t>
             </w:r>
           </w:p>
         </w:tc>
@@ -250,6 +347,7 @@
         <w:tc>
           <w:tcPr>
             <w:tcW w:type="dxa" w:w="2880"/>
+            <w:shd w:val="clear" w:fill="F8F7F8"/>
           </w:tcPr>
           <w:p>
             <w:r>
@@ -260,20 +358,40 @@
         <w:tc>
           <w:tcPr>
             <w:tcW w:type="dxa" w:w="2880"/>
+            <w:shd w:val="clear" w:fill="F8F7F8"/>
           </w:tcPr>
           <w:p>
             <w:r>
-              <w:t>0% (model estimate (unvalidated))</w:t>
+              <w:t>0%</w:t>
+            </w:r>
+          </w:p>
+          <w:p>
+            <w:r>
+              <w:rPr>
+                <w:color w:val="6F717A"/>
+                <w:sz w:val="17"/>
+              </w:rPr>
+              <w:t>AI estimate (unchecked)</w:t>
             </w:r>
           </w:p>
         </w:tc>
         <w:tc>
           <w:tcPr>
             <w:tcW w:type="dxa" w:w="2880"/>
+            <w:shd w:val="clear" w:fill="F8F7F8"/>
           </w:tcPr>
           <w:p>
             <w:r>
-              <w:t>100% (model estimate (unvalidated))</w:t>
+              <w:t>100%</w:t>
+            </w:r>
+          </w:p>
+          <w:p>
+            <w:r>
+              <w:rPr>
+                <w:color w:val="6F717A"/>
+                <w:sz w:val="17"/>
+              </w:rPr>
+              <w:t>AI estimate (unchecked)</w:t>
             </w:r>
           </w:p>
         </w:tc>
@@ -281,7 +399,30 @@
     </w:tbl>
     <w:p>
       <w:pPr>
+        <w:spacing w:before="0" w:after="40"/>
+      </w:pPr>
+    </w:p>
+    <w:p>
+      <w:r>
+        <w:rPr>
+          <w:b/>
+          <w:color w:val="6F717A"/>
+          <w:sz w:val="17"/>
+        </w:rPr>
+        <w:t xml:space="preserve">Source labels: </w:t>
+      </w:r>
+      <w:r>
+        <w:rPr>
+          <w:color w:val="6F717A"/>
+          <w:sz w:val="17"/>
+        </w:rPr>
+        <w:t>Partly verified = mixed (61% staff-verified), mixed (79% staff-verified), mixed (57% staff-verified), mixed (67% staff-verified); AI estimate (unchecked) = model estimate (unvalidated).</w:t>
+      </w:r>
+    </w:p>
+    <w:p>
+      <w:pPr>
         <w:pStyle w:val="ListBullet"/>
+        <w:spacing w:before="0" w:after="40"/>
       </w:pPr>
       <w:r>
         <w:rPr>
@@ -296,6 +437,7 @@
     <w:p>
       <w:pPr>
         <w:pStyle w:val="ListBullet"/>
+        <w:spacing w:before="0" w:after="40"/>
       </w:pPr>
       <w:r>
         <w:rPr>
@@ -310,6 +452,7 @@
     <w:p>
       <w:pPr>
         <w:pStyle w:val="ListBullet"/>
+        <w:spacing w:before="0" w:after="40"/>
       </w:pPr>
       <w:r>
         <w:rPr>
@@ -324,6 +467,7 @@
     <w:p>
       <w:pPr>
         <w:pStyle w:val="ListBullet"/>
+        <w:spacing w:before="0" w:after="40"/>
       </w:pPr>
       <w:r>
         <w:rPr>
@@ -332,22 +476,30 @@
         <w:t xml:space="preserve">Positive expressions (unvalidated): </w:t>
       </w:r>
       <w:r>
-        <w:t>Among 8-second clips where faces were visible, the share where the AI suggested a positive expression such as a smile. This is an unvalidated AI suggestion about what the camera shows, never a measure of feelings.</w:t>
+        <w:t>Among short clips where faces were visible, the share where the AI suggested a positive expression such as a smile. This is an unchecked suggestion about what the camera shows, never a measure of feelings.</w:t>
       </w:r>
     </w:p>
     <w:p>
       <w:pPr>
         <w:pStyle w:val="Heading1"/>
+        <w:spacing w:before="280" w:after="120"/>
       </w:pPr>
       <w:r>
-        <w:t>How much of the footage was youth-led?</w:t>
+        <w:t>Who was leading?</w:t>
       </w:r>
     </w:p>
     <w:tbl>
       <w:tblPr>
-        <w:tblStyle w:val="LightGrid-Accent1"/>
         <w:tblW w:type="auto" w:w="0"/>
         <w:tblLook w:firstColumn="1" w:firstRow="1" w:lastColumn="0" w:lastRow="0" w:noHBand="0" w:noVBand="1" w:val="04A0"/>
+        <w:tblBorders>
+          <w:top w:val="single" w:sz="4" w:color="E6E3EA"/>
+          <w:left w:val="single" w:sz="4" w:color="E6E3EA"/>
+          <w:bottom w:val="single" w:sz="4" w:color="E6E3EA"/>
+          <w:right w:val="single" w:sz="4" w:color="E6E3EA"/>
+          <w:insideH w:val="single" w:sz="4" w:color="E6E3EA"/>
+          <w:insideV w:val="single" w:sz="4" w:color="E6E3EA"/>
+        </w:tblBorders>
       </w:tblPr>
       <w:tblGrid>
         <w:gridCol w:w="2880"/>
@@ -358,9 +510,14 @@
         <w:tc>
           <w:tcPr>
             <w:tcW w:type="dxa" w:w="2880"/>
+            <w:shd w:val="clear" w:fill="4100AD"/>
           </w:tcPr>
           <w:p>
             <w:r>
+              <w:rPr>
+                <w:b/>
+                <w:color w:val="FFFFFF"/>
+              </w:rPr>
               <w:t>Time</w:t>
             </w:r>
           </w:p>
@@ -368,9 +525,14 @@
         <w:tc>
           <w:tcPr>
             <w:tcW w:type="dxa" w:w="2880"/>
+            <w:shd w:val="clear" w:fill="4100AD"/>
           </w:tcPr>
           <w:p>
             <w:r>
+              <w:rPr>
+                <w:b/>
+                <w:color w:val="FFFFFF"/>
+              </w:rPr>
               <w:t>Minutes</w:t>
             </w:r>
           </w:p>
@@ -378,9 +540,14 @@
         <w:tc>
           <w:tcPr>
             <w:tcW w:type="dxa" w:w="2880"/>
+            <w:shd w:val="clear" w:fill="4100AD"/>
           </w:tcPr>
           <w:p>
             <w:r>
+              <w:rPr>
+                <w:b/>
+                <w:color w:val="FFFFFF"/>
+              </w:rPr>
               <w:t>Share of all footage</w:t>
             </w:r>
           </w:p>
@@ -393,7 +560,7 @@
           </w:tcPr>
           <w:p>
             <w:r>
-              <w:t>Youth</w:t>
+              <w:t>Young people leading</w:t>
             </w:r>
           </w:p>
         </w:tc>
@@ -422,16 +589,18 @@
         <w:tc>
           <w:tcPr>
             <w:tcW w:type="dxa" w:w="2880"/>
+            <w:shd w:val="clear" w:fill="F8F7F8"/>
           </w:tcPr>
           <w:p>
             <w:r>
-              <w:t>Staff-led, confirmed by staff</w:t>
+              <w:t>Staff leading, confirmed by staff</w:t>
             </w:r>
           </w:p>
         </w:tc>
         <w:tc>
           <w:tcPr>
             <w:tcW w:type="dxa" w:w="2880"/>
+            <w:shd w:val="clear" w:fill="F8F7F8"/>
           </w:tcPr>
           <w:p>
             <w:r>
@@ -442,6 +611,7 @@
         <w:tc>
           <w:tcPr>
             <w:tcW w:type="dxa" w:w="2880"/>
+            <w:shd w:val="clear" w:fill="F8F7F8"/>
           </w:tcPr>
           <w:p>
             <w:r>
@@ -457,7 +627,7 @@
           </w:tcPr>
           <w:p>
             <w:r>
-              <w:t>Staff-led, AI estimate</w:t>
+              <w:t>Staff leading, AI estimate</w:t>
             </w:r>
           </w:p>
         </w:tc>
@@ -486,6 +656,7 @@
         <w:tc>
           <w:tcPr>
             <w:tcW w:type="dxa" w:w="2880"/>
+            <w:shd w:val="clear" w:fill="F8F7F8"/>
           </w:tcPr>
           <w:p>
             <w:r>
@@ -496,6 +667,7 @@
         <w:tc>
           <w:tcPr>
             <w:tcW w:type="dxa" w:w="2880"/>
+            <w:shd w:val="clear" w:fill="F8F7F8"/>
           </w:tcPr>
           <w:p>
             <w:r>
@@ -506,6 +678,7 @@
         <w:tc>
           <w:tcPr>
             <w:tcW w:type="dxa" w:w="2880"/>
+            <w:shd w:val="clear" w:fill="F8F7F8"/>
           </w:tcPr>
           <w:p>
             <w:r>
@@ -516,6 +689,11 @@
       </w:tr>
     </w:tbl>
     <w:p>
+      <w:pPr>
+        <w:spacing w:before="0" w:after="40"/>
+      </w:pPr>
+    </w:p>
+    <w:p>
       <w:r>
         <w:t>Staff-led and idle time are left out of every youth number in this report.</w:t>
       </w:r>
@@ -523,39 +701,70 @@
     <w:p>
       <w:pPr>
         <w:pStyle w:val="Heading1"/>
+        <w:spacing w:before="280" w:after="120"/>
       </w:pPr>
       <w:r>
-        <w:t>How accurate is the AI?</w:t>
+        <w:t>How we measured it</w:t>
       </w:r>
     </w:p>
     <w:p>
       <w:r>
-        <w:t>A staff member labeled 30 short clips (8 seconds each) without seeing the AI's suggestions. We compared each version of the AI with those labels.</w:t>
+        <w:t>We looked at 4 videos and 80 short clips. The AI finds moments in the footage and suggests what is happening; TPA staff then check and confirm those suggestions.</w:t>
+      </w:r>
+    </w:p>
+    <w:p>
+      <w:r>
+        <w:t>Accuracy check: a staff member labelled 30 clips without seeing the AI's suggestions. The AI's main activity matched the staff label in 70% of them (likely range 50–85%). AI suggestions are a starting point; staff review confirms them.</w:t>
+      </w:r>
+    </w:p>
+    <w:p>
+      <w:pPr>
+        <w:pStyle w:val="Heading1"/>
+        <w:spacing w:before="280" w:after="120"/>
+      </w:pPr>
+      <w:r>
+        <w:t>How the data is protected</w:t>
       </w:r>
     </w:p>
     <w:p>
       <w:pPr>
         <w:pStyle w:val="ListBullet"/>
+        <w:spacing w:before="0" w:after="40"/>
       </w:pPr>
       <w:r>
-        <w:rPr>
-          <w:b/>
-        </w:rPr>
-        <w:t xml:space="preserve">The AI on its own: </w:t>
-      </w:r>
-      <w:r>
-        <w:t>the main activity label matched the staff member's label about 70 out of 100 times (range 50–85).</w:t>
+        <w:t>Everything runs on one private computer. Nothing is sent to cloud services.</w:t>
       </w:r>
     </w:p>
     <w:p>
+      <w:pPr>
+        <w:pStyle w:val="ListBullet"/>
+        <w:spacing w:before="0" w:after="40"/>
+      </w:pPr>
       <w:r>
-        <w:t>AI suggestions are a starting point. Staff review confirms them before they are used.</w:t>
+        <w:t>No faces are stored, and no names are recorded.</w:t>
+      </w:r>
+    </w:p>
+    <w:p>
+      <w:pPr>
+        <w:pStyle w:val="ListBullet"/>
+        <w:spacing w:before="0" w:after="40"/>
+      </w:pPr>
+      <w:r>
+        <w:t>There are no individual scores. Results describe the footage, never a young person.</w:t>
       </w:r>
     </w:p>
     <w:tbl>
       <w:tblPr>
         <w:tblW w:type="auto" w:w="0"/>
         <w:tblLook w:firstColumn="1" w:firstRow="1" w:lastColumn="0" w:lastRow="0" w:noHBand="0" w:noVBand="1" w:val="04A0"/>
+        <w:tblBorders>
+          <w:top w:val="single" w:sz="4" w:color="E6E3EA"/>
+          <w:left w:val="single" w:sz="4" w:color="E6E3EA"/>
+          <w:bottom w:val="single" w:sz="4" w:color="E6E3EA"/>
+          <w:right w:val="single" w:sz="4" w:color="E6E3EA"/>
+          <w:insideH w:val="single" w:sz="4" w:color="E6E3EA"/>
+          <w:insideV w:val="single" w:sz="4" w:color="E6E3EA"/>
+        </w:tblBorders>
       </w:tblPr>
       <w:tblGrid>
         <w:gridCol w:w="8640"/>
@@ -564,12 +773,16 @@
         <w:tc>
           <w:tcPr>
             <w:tcW w:type="dxa" w:w="8640"/>
-            <w:shd w:val="clear" w:fill="F8F7F8"/>
+            <w:shd w:val="clear" w:fill="F1ECF9"/>
           </w:tcPr>
           <w:p>
+            <w:pPr>
+              <w:spacing w:before="80" w:after="80"/>
+            </w:pPr>
             <w:r>
               <w:rPr>
                 <w:b/>
+                <w:color w:val="4100AD"/>
               </w:rPr>
               <w:t>What the labels mean</w:t>
             </w:r>
@@ -577,101 +790,81 @@
           <w:p>
             <w:pPr>
               <w:pStyle w:val="ListBullet"/>
+              <w:spacing w:before="0" w:after="60"/>
             </w:pPr>
             <w:r>
-              <w:t>staff-verified: Every 8-second clip behind this number was checked and confirmed by TPA staff.</w:t>
+              <w:t>Staff-verified: Every clip behind this number was checked and confirmed by TPA staff. (tag: staff-verified)</w:t>
             </w:r>
           </w:p>
           <w:p>
             <w:pPr>
               <w:pStyle w:val="ListBullet"/>
+              <w:spacing w:before="0" w:after="60"/>
             </w:pPr>
             <w:r>
-              <w:t>model estimate (learned): No clip behind this number was checked by staff; it comes from an AI model trained on staff labels.</w:t>
+              <w:t>Partly verified: Part of this number was confirmed by staff; the exact tag gives the percentage. (tag: mixed (NN% staff-verified))</w:t>
             </w:r>
           </w:p>
           <w:p>
             <w:pPr>
               <w:pStyle w:val="ListBullet"/>
+              <w:spacing w:before="0" w:after="60"/>
             </w:pPr>
             <w:r>
-              <w:t>mixed (NN% staff-verified): Part of this number was confirmed by staff; NN tells you what percentage.</w:t>
+              <w:t>AI estimate (trained): No clip behind this number was checked by staff; it comes from an AI model trained on staff labels. (tag: model estimate (learned))</w:t>
             </w:r>
           </w:p>
           <w:p>
             <w:pPr>
               <w:pStyle w:val="ListBullet"/>
+              <w:spacing w:before="0" w:after="60"/>
             </w:pPr>
             <w:r>
-              <w:t>model estimate (unvalidated): No clip behind this number was checked by staff; it is an AI suggestion only.</w:t>
+              <w:t>AI estimate (unchecked): No clip behind this number was checked by staff; it is an AI suggestion only. (tag: model estimate (unvalidated))</w:t>
             </w:r>
           </w:p>
         </w:tc>
       </w:tr>
     </w:tbl>
-    <w:p/>
+    <w:p>
+      <w:pPr>
+        <w:spacing w:before="0" w:after="80"/>
+      </w:pPr>
+    </w:p>
     <w:p>
       <w:pPr>
         <w:pStyle w:val="Heading1"/>
+        <w:spacing w:before="280" w:after="120"/>
       </w:pPr>
       <w:r>
-        <w:t>Limitations</w:t>
+        <w:t>Good to know</w:t>
       </w:r>
     </w:p>
     <w:p>
       <w:pPr>
         <w:pStyle w:val="ListBullet"/>
+        <w:spacing w:before="0" w:after="40"/>
       </w:pPr>
       <w:r>
-        <w:t>single labeler: verified labels come from one staff member</w:t>
+        <w:t>Numbers marked as AI estimates have not been checked by staff yet. Staff-verified numbers are the most reliable.</w:t>
       </w:r>
     </w:p>
     <w:p>
       <w:pPr>
         <w:pStyle w:val="ListBullet"/>
+        <w:spacing w:before="0" w:after="40"/>
       </w:pPr>
       <w:r>
-        <w:t>model actor and category scores are weak, so staff exclusion is mostly reliable only on reviewed clips</w:t>
+        <w:t>Every number describes the footage as a whole, not any individual young person.</w:t>
       </w:r>
     </w:p>
     <w:p>
       <w:pPr>
         <w:pStyle w:val="ListBullet"/>
+        <w:spacing w:before="0" w:after="40"/>
       </w:pPr>
       <w:r>
-        <w:t>review-mode decisions are per moment: one decision verifies every segment in that moment</w:t>
-      </w:r>
-    </w:p>
-    <w:p>
-      <w:pPr>
-        <w:pStyle w:val="ListBullet"/>
-      </w:pPr>
-      <w:r>
-        <w:t>audio conditions use a fixed 0.5 AST probability, not a dev-tuned threshold</w:t>
-      </w:r>
-    </w:p>
-    <w:p>
-      <w:pPr>
-        <w:pStyle w:val="ListBullet"/>
-      </w:pPr>
-      <w:r>
-        <w:t>expressions are observable, unvalidated model estimates, never feelings; segments with faces only</w:t>
-      </w:r>
-    </w:p>
-    <w:p>
-      <w:pPr>
-        <w:pStyle w:val="ListBullet"/>
-      </w:pPr>
-      <w:r>
-        <w:t>person_count counts people at least 15% of frame height (performers); distant audience heads are dropped</w:t>
-      </w:r>
-    </w:p>
-    <w:p>
-      <w:pPr>
-        <w:pStyle w:val="ListBullet"/>
-      </w:pPr>
-      <w:r>
-        <w:t>learned labels come from a model trained on ~206 labels from two videos; on labeled segments they are in-sample</w:t>
+        <w:t>The showcase is a performance, so some increase in performing time is expected by design.</w:t>
       </w:r>
     </w:p>
     <w:sectPr>
@@ -704,7 +897,32 @@
         <w:color w:val="6F717A"/>
         <w:sz w:val="16"/>
       </w:rPr>
-      <w:t>Guideline version 0.6.0 (current vocabulary) · Results: insights-20261025T015244-652f · Generated 2026-10-25</w:t>
+      <w:t xml:space="preserve">Built for The Performance Academy · Page </w:t>
+    </w:r>
+    <w:r>
+      <w:rPr>
+        <w:color w:val="6F717A"/>
+        <w:sz w:val="16"/>
+      </w:rPr>
+      <w:fldChar w:fldCharType="begin"/>
+      <w:instrText xml:space="preserve"> PAGE </w:instrText>
+      <w:fldChar w:fldCharType="end"/>
+    </w:r>
+    <w:r>
+      <w:rPr>
+        <w:color w:val="6F717A"/>
+        <w:sz w:val="16"/>
+      </w:rPr>
+      <w:t xml:space="preserve"> of </w:t>
+    </w:r>
+    <w:r>
+      <w:rPr>
+        <w:color w:val="6F717A"/>
+        <w:sz w:val="16"/>
+      </w:rPr>
+      <w:fldChar w:fldCharType="begin"/>
+      <w:instrText xml:space="preserve"> NUMPAGES </w:instrText>
+      <w:fldChar w:fldCharType="end"/>
     </w:r>
   </w:p>
 </w:ftr>
@@ -1074,6 +1292,7 @@
     <w:qFormat/>
     <w:rsid w:val="00FC693F"/>
     <w:rPr>
+      <w:rFonts w:ascii="Calibri" w:hAnsi="Calibri" w:eastAsia="Calibri"/>
       <w:color w:val="201C25"/>
       <w:sz w:val="21"/>
     </w:rPr>
@@ -1137,7 +1356,7 @@
       <w:outlineLvl w:val="0"/>
     </w:pPr>
     <w:rPr>
-      <w:rFonts w:asciiTheme="majorHAnsi" w:eastAsiaTheme="majorEastAsia" w:hAnsiTheme="majorHAnsi" w:cstheme="majorBidi"/>
+      <w:rFonts w:asciiTheme="majorHAnsi" w:eastAsiaTheme="majorEastAsia" w:hAnsiTheme="majorHAnsi" w:cstheme="majorBidi" w:ascii="Calibri" w:hAnsi="Calibri" w:eastAsia="Calibri"/>
       <w:b/>
       <w:bCs/>
       <w:color w:val="4100AD"/>
@@ -1164,7 +1383,7 @@
       <w:rFonts w:asciiTheme="majorHAnsi" w:eastAsiaTheme="majorEastAsia" w:hAnsiTheme="majorHAnsi" w:cstheme="majorBidi"/>
       <w:b/>
       <w:bCs/>
-      <w:color w:val="4100AD"/>
+      <w:color w:val="4F81BD" w:themeColor="accent1"/>
       <w:sz w:val="26"/>
       <w:szCs w:val="26"/>
     </w:rPr>
@@ -1426,7 +1645,7 @@
       <w:contextualSpacing/>
     </w:pPr>
     <w:rPr>
-      <w:rFonts w:asciiTheme="majorHAnsi" w:eastAsiaTheme="majorEastAsia" w:hAnsiTheme="majorHAnsi" w:cstheme="majorBidi"/>
+      <w:rFonts w:asciiTheme="majorHAnsi" w:eastAsiaTheme="majorEastAsia" w:hAnsiTheme="majorHAnsi" w:cstheme="majorBidi" w:ascii="Calibri" w:hAnsi="Calibri" w:eastAsia="Calibri"/>
       <w:color w:val="4100AD"/>
       <w:spacing w:val="5"/>
       <w:kern w:val="28"/>
@@ -1606,6 +1825,9 @@
       </w:numPr>
       <w:contextualSpacing/>
     </w:pPr>
+    <w:rPr>
+      <w:rFonts w:ascii="Calibri" w:hAnsi="Calibri" w:eastAsia="Calibri"/>
+    </w:rPr>
   </w:style>
   <w:style w:type="paragraph" w:styleId="ListBullet2">
     <w:name w:val="List Bullet 2"/>

</xml_diff>